<commit_message>
Remove Assignment2_Submission.zip and update SIT_Report.docx
</commit_message>
<xml_diff>
--- a/SIT_Report.docx
+++ b/SIT_Report.docx
@@ -78,6 +78,154 @@
         <w:t xml:space="preserve">5</w:t>
       </w:r>
     </w:p>
+    <w:p>
+      <w:pPr>
+        <w:jc w:val="center"/>
+      </w:pPr>
+      <w:r>
+        <w:rPr>
+          <w:i/>
+        </w:rPr>
+        <w:t>Software Testing — Assignment 2 · System Integration Testing</w:t>
+      </w:r>
+    </w:p>
+    <w:p>
+      <w:pPr>
+        <w:jc w:val="center"/>
+      </w:pPr>
+      <w:r>
+        <w:t>6 October 2026</w:t>
+      </w:r>
+    </w:p>
+    <w:tbl>
+      <w:tblPr>
+        <w:tblW w:type="auto" w:w="0"/>
+        <w:tblLook w:firstColumn="1" w:firstRow="1" w:lastColumn="0" w:lastRow="0" w:noHBand="0" w:noVBand="1" w:val="04A0"/>
+        <w:jc w:val="center"/>
+        <w:tblBorders>
+          <w:top w:val="single" w:sz="4" w:color="999999"/>
+          <w:left w:val="single" w:sz="4" w:color="999999"/>
+          <w:bottom w:val="single" w:sz="4" w:color="999999"/>
+          <w:right w:val="single" w:sz="4" w:color="999999"/>
+          <w:insideH w:val="single" w:sz="4" w:color="999999"/>
+          <w:insideV w:val="single" w:sz="4" w:color="999999"/>
+        </w:tblBorders>
+      </w:tblPr>
+      <w:tblGrid>
+        <w:gridCol w:w="4680"/>
+        <w:gridCol w:w="4680"/>
+      </w:tblGrid>
+      <w:tr>
+        <w:tc>
+          <w:tcPr>
+            <w:tcW w:type="dxa" w:w="4680"/>
+          </w:tcPr>
+          <w:p>
+            <w:r/>
+            <w:r>
+              <w:rPr>
+                <w:b/>
+                <w:sz w:val="20"/>
+              </w:rPr>
+              <w:t>Student name</w:t>
+            </w:r>
+          </w:p>
+        </w:tc>
+        <w:tc>
+          <w:tcPr>
+            <w:tcW w:type="dxa" w:w="4680"/>
+          </w:tcPr>
+          <w:p>
+            <w:r/>
+            <w:r>
+              <w:rPr>
+                <w:b/>
+                <w:sz w:val="20"/>
+              </w:rPr>
+              <w:t>Student ID</w:t>
+            </w:r>
+          </w:p>
+        </w:tc>
+      </w:tr>
+      <w:tr>
+        <w:tc>
+          <w:tcPr>
+            <w:tcW w:type="dxa" w:w="4680"/>
+          </w:tcPr>
+          <w:p>
+            <w:r/>
+            <w:r>
+              <w:rPr>
+                <w:sz w:val="20"/>
+              </w:rPr>
+              <w:t>Amos Nkurunziza</w:t>
+            </w:r>
+          </w:p>
+        </w:tc>
+        <w:tc>
+          <w:tcPr>
+            <w:tcW w:type="dxa" w:w="4680"/>
+          </w:tcPr>
+          <w:p>
+            <w:r/>
+            <w:r>
+              <w:rPr>
+                <w:sz w:val="20"/>
+              </w:rPr>
+              <w:t>26973</w:t>
+            </w:r>
+          </w:p>
+        </w:tc>
+      </w:tr>
+      <w:tr>
+        <w:tc>
+          <w:tcPr>
+            <w:tcW w:type="dxa" w:w="4680"/>
+          </w:tcPr>
+          <w:p>
+            <w:r/>
+            <w:r>
+              <w:rPr>
+                <w:sz w:val="20"/>
+              </w:rPr>
+              <w:t>Solide AZE</w:t>
+            </w:r>
+          </w:p>
+        </w:tc>
+        <w:tc>
+          <w:tcPr>
+            <w:tcW w:type="dxa" w:w="4680"/>
+          </w:tcPr>
+          <w:p>
+            <w:r/>
+            <w:r>
+              <w:rPr>
+                <w:sz w:val="20"/>
+              </w:rPr>
+              <w:t>27396</w:t>
+            </w:r>
+          </w:p>
+        </w:tc>
+      </w:tr>
+    </w:tbl>
+    <w:p>
+      <w:pPr>
+        <w:jc w:val="center"/>
+      </w:pPr>
+      <w:r>
+        <w:t xml:space="preserve">GitHub repository: </w:t>
+      </w:r>
+      <w:hyperlink r:id="rId12">
+        <w:r>
+          <w:rPr>
+            <w:color w:val="0563C1"/>
+            <w:u w:val="single"/>
+          </w:rPr>
+          <w:t>https://github.com/Llego-250/26973---27396-Assignment-2</w:t>
+        </w:r>
+      </w:hyperlink>
+    </w:p>
+    <w:p/>
     <w:bookmarkStart w:id="20" w:name="introduction"/>
     <w:p>
       <w:pPr>
@@ -339,6 +487,14 @@
       </w:pPr>
       <w:r>
         <w:t xml:space="preserve">3. Test cases and results</w:t>
+      </w:r>
+    </w:p>
+    <w:p>
+      <w:r>
+        <w:rPr>
+          <w:i/>
+        </w:rPr>
+        <w:t>Table 1: System integration test cases and results.</w:t>
       </w:r>
     </w:p>
     <w:tbl>
@@ -347,6 +503,14 @@
         <w:tblW w:type="pct" w:w="5000"/>
         <w:tblLook w:firstRow="1" w:lastRow="0" w:firstColumn="0" w:lastColumn="0" w:noHBand="0" w:noVBand="0" w:val="0020"/>
         <w:jc w:val="start"/>
+        <w:tblBorders>
+          <w:top w:val="single" w:sz="4" w:color="999999"/>
+          <w:left w:val="single" w:sz="4" w:color="999999"/>
+          <w:bottom w:val="single" w:sz="4" w:color="999999"/>
+          <w:right w:val="single" w:sz="4" w:color="999999"/>
+          <w:insideH w:val="single" w:sz="4" w:color="999999"/>
+          <w:insideV w:val="single" w:sz="4" w:color="999999"/>
+        </w:tblBorders>
       </w:tblPr>
       <w:tblGrid>
         <w:gridCol w:w="1320"/>
@@ -368,6 +532,9 @@
               <w:jc w:val="left"/>
             </w:pPr>
             <w:r>
+              <w:rPr>
+                <w:b/>
+              </w:rPr>
               <w:t xml:space="preserve">Test ID</w:t>
             </w:r>
           </w:p>
@@ -380,6 +547,9 @@
               <w:jc w:val="left"/>
             </w:pPr>
             <w:r>
+              <w:rPr>
+                <w:b/>
+              </w:rPr>
               <w:t xml:space="preserve">Integration scenario</w:t>
             </w:r>
           </w:p>
@@ -392,6 +562,9 @@
               <w:jc w:val="left"/>
             </w:pPr>
             <w:r>
+              <w:rPr>
+                <w:b/>
+              </w:rPr>
               <w:t xml:space="preserve">Input</w:t>
             </w:r>
           </w:p>
@@ -404,6 +577,9 @@
               <w:jc w:val="left"/>
             </w:pPr>
             <w:r>
+              <w:rPr>
+                <w:b/>
+              </w:rPr>
               <w:t xml:space="preserve">Expected result</w:t>
             </w:r>
           </w:p>
@@ -416,6 +592,9 @@
               <w:jc w:val="left"/>
             </w:pPr>
             <w:r>
+              <w:rPr>
+                <w:b/>
+              </w:rPr>
               <w:t xml:space="preserve">Actual</w:t>
             </w:r>
           </w:p>
@@ -428,6 +607,9 @@
               <w:jc w:val="left"/>
             </w:pPr>
             <w:r>
+              <w:rPr>
+                <w:b/>
+              </w:rPr>
               <w:t xml:space="preserve">Status</w:t>
             </w:r>
           </w:p>
@@ -1241,6 +1423,9 @@
       </w:r>
     </w:p>
     <w:p>
+      <w:pPr>
+        <w:jc w:val="center"/>
+      </w:pPr>
       <w:r>
         <w:drawing>
           <wp:inline>
@@ -1277,6 +1462,9 @@
       </w:r>
     </w:p>
     <w:p>
+      <w:pPr>
+        <w:jc w:val="center"/>
+      </w:pPr>
       <w:r>
         <w:rPr>
           <w:i/>
@@ -1322,6 +1510,9 @@
       </w:r>
     </w:p>
     <w:p>
+      <w:pPr>
+        <w:jc w:val="center"/>
+      </w:pPr>
       <w:r>
         <w:drawing>
           <wp:inline>
@@ -1358,6 +1549,9 @@
       </w:r>
     </w:p>
     <w:p>
+      <w:pPr>
+        <w:jc w:val="center"/>
+      </w:pPr>
       <w:r>
         <w:rPr>
           <w:i/>
@@ -1675,6 +1869,9 @@
       </w:r>
     </w:p>
     <w:p>
+      <w:pPr>
+        <w:jc w:val="center"/>
+      </w:pPr>
       <w:r>
         <w:drawing>
           <wp:inline>
@@ -1711,6 +1908,9 @@
       </w:r>
     </w:p>
     <w:p>
+      <w:pPr>
+        <w:jc w:val="center"/>
+      </w:pPr>
       <w:r>
         <w:rPr>
           <w:i/>
@@ -1718,6 +1918,734 @@
         <w:t>Figure 3: With the deliberate defect, 8 integration tests fail (BUILD FAILURE).</w:t>
       </w:r>
     </w:p>
+    <w:p>
+      <w:r>
+        <w:rPr>
+          <w:i/>
+        </w:rPr>
+        <w:t>Table 2: Integration test outcome before and after the defect was introduced.</w:t>
+      </w:r>
+    </w:p>
+    <w:tbl>
+      <w:tblPr>
+        <w:tblW w:type="auto" w:w="0"/>
+        <w:tblLook w:firstColumn="1" w:firstRow="1" w:lastColumn="0" w:lastRow="0" w:noHBand="0" w:noVBand="1" w:val="04A0"/>
+        <w:tblBorders>
+          <w:top w:val="single" w:sz="4" w:color="999999"/>
+          <w:left w:val="single" w:sz="4" w:color="999999"/>
+          <w:bottom w:val="single" w:sz="4" w:color="999999"/>
+          <w:right w:val="single" w:sz="4" w:color="999999"/>
+          <w:insideH w:val="single" w:sz="4" w:color="999999"/>
+          <w:insideV w:val="single" w:sz="4" w:color="999999"/>
+        </w:tblBorders>
+      </w:tblPr>
+      <w:tblGrid>
+        <w:gridCol w:w="2340"/>
+        <w:gridCol w:w="2340"/>
+        <w:gridCol w:w="2340"/>
+        <w:gridCol w:w="2340"/>
+      </w:tblGrid>
+      <w:tr>
+        <w:tc>
+          <w:tcPr>
+            <w:tcW w:type="dxa" w:w="2340"/>
+          </w:tcPr>
+          <w:p>
+            <w:r/>
+            <w:r>
+              <w:rPr>
+                <w:b/>
+                <w:sz w:val="20"/>
+              </w:rPr>
+              <w:t>Test</w:t>
+            </w:r>
+          </w:p>
+        </w:tc>
+        <w:tc>
+          <w:tcPr>
+            <w:tcW w:type="dxa" w:w="2340"/>
+          </w:tcPr>
+          <w:p>
+            <w:r/>
+            <w:r>
+              <w:rPr>
+                <w:b/>
+                <w:sz w:val="20"/>
+              </w:rPr>
+              <w:t>Correct code</w:t>
+            </w:r>
+          </w:p>
+        </w:tc>
+        <w:tc>
+          <w:tcPr>
+            <w:tcW w:type="dxa" w:w="2340"/>
+          </w:tcPr>
+          <w:p>
+            <w:r/>
+            <w:r>
+              <w:rPr>
+                <w:b/>
+                <w:sz w:val="20"/>
+              </w:rPr>
+              <w:t>With defect</w:t>
+            </w:r>
+          </w:p>
+        </w:tc>
+        <w:tc>
+          <w:tcPr>
+            <w:tcW w:type="dxa" w:w="2340"/>
+          </w:tcPr>
+          <w:p>
+            <w:r/>
+            <w:r>
+              <w:rPr>
+                <w:b/>
+                <w:sz w:val="20"/>
+              </w:rPr>
+              <w:t>Reason</w:t>
+            </w:r>
+          </w:p>
+        </w:tc>
+      </w:tr>
+      <w:tr>
+        <w:tc>
+          <w:tcPr>
+            <w:tcW w:type="dxa" w:w="2340"/>
+          </w:tcPr>
+          <w:p>
+            <w:r/>
+            <w:r>
+              <w:rPr>
+                <w:sz w:val="20"/>
+              </w:rPr>
+              <w:t>SIT-01</w:t>
+            </w:r>
+          </w:p>
+        </w:tc>
+        <w:tc>
+          <w:tcPr>
+            <w:tcW w:type="dxa" w:w="2340"/>
+          </w:tcPr>
+          <w:p>
+            <w:r/>
+            <w:r>
+              <w:rPr>
+                <w:sz w:val="20"/>
+              </w:rPr>
+              <w:t>Pass</w:t>
+            </w:r>
+          </w:p>
+        </w:tc>
+        <w:tc>
+          <w:tcPr>
+            <w:tcW w:type="dxa" w:w="2340"/>
+          </w:tcPr>
+          <w:p>
+            <w:r/>
+            <w:r>
+              <w:rPr>
+                <w:sz w:val="20"/>
+              </w:rPr>
+              <w:t>Fail</w:t>
+            </w:r>
+          </w:p>
+        </w:tc>
+        <w:tc>
+          <w:tcPr>
+            <w:tcW w:type="dxa" w:w="2340"/>
+          </w:tcPr>
+          <w:p>
+            <w:r/>
+            <w:r>
+              <w:rPr>
+                <w:sz w:val="20"/>
+              </w:rPr>
+              <w:t>Valid order wrongly rejected</w:t>
+            </w:r>
+          </w:p>
+        </w:tc>
+      </w:tr>
+      <w:tr>
+        <w:tc>
+          <w:tcPr>
+            <w:tcW w:type="dxa" w:w="2340"/>
+          </w:tcPr>
+          <w:p>
+            <w:r/>
+            <w:r>
+              <w:rPr>
+                <w:sz w:val="20"/>
+              </w:rPr>
+              <w:t>SIT-02</w:t>
+            </w:r>
+          </w:p>
+        </w:tc>
+        <w:tc>
+          <w:tcPr>
+            <w:tcW w:type="dxa" w:w="2340"/>
+          </w:tcPr>
+          <w:p>
+            <w:r/>
+            <w:r>
+              <w:rPr>
+                <w:sz w:val="20"/>
+              </w:rPr>
+              <w:t>Pass</w:t>
+            </w:r>
+          </w:p>
+        </w:tc>
+        <w:tc>
+          <w:tcPr>
+            <w:tcW w:type="dxa" w:w="2340"/>
+          </w:tcPr>
+          <w:p>
+            <w:r/>
+            <w:r>
+              <w:rPr>
+                <w:sz w:val="20"/>
+              </w:rPr>
+              <w:t>Fail</w:t>
+            </w:r>
+          </w:p>
+        </w:tc>
+        <w:tc>
+          <w:tcPr>
+            <w:tcW w:type="dxa" w:w="2340"/>
+          </w:tcPr>
+          <w:p>
+            <w:r/>
+            <w:r>
+              <w:rPr>
+                <w:sz w:val="20"/>
+              </w:rPr>
+              <w:t>Valid order wrongly rejected</w:t>
+            </w:r>
+          </w:p>
+        </w:tc>
+      </w:tr>
+      <w:tr>
+        <w:tc>
+          <w:tcPr>
+            <w:tcW w:type="dxa" w:w="2340"/>
+          </w:tcPr>
+          <w:p>
+            <w:r/>
+            <w:r>
+              <w:rPr>
+                <w:sz w:val="20"/>
+              </w:rPr>
+              <w:t>SIT-03</w:t>
+            </w:r>
+          </w:p>
+        </w:tc>
+        <w:tc>
+          <w:tcPr>
+            <w:tcW w:type="dxa" w:w="2340"/>
+          </w:tcPr>
+          <w:p>
+            <w:r/>
+            <w:r>
+              <w:rPr>
+                <w:sz w:val="20"/>
+              </w:rPr>
+              <w:t>Pass</w:t>
+            </w:r>
+          </w:p>
+        </w:tc>
+        <w:tc>
+          <w:tcPr>
+            <w:tcW w:type="dxa" w:w="2340"/>
+          </w:tcPr>
+          <w:p>
+            <w:r/>
+            <w:r>
+              <w:rPr>
+                <w:sz w:val="20"/>
+              </w:rPr>
+              <w:t>Fail</w:t>
+            </w:r>
+          </w:p>
+        </w:tc>
+        <w:tc>
+          <w:tcPr>
+            <w:tcW w:type="dxa" w:w="2340"/>
+          </w:tcPr>
+          <w:p>
+            <w:r/>
+            <w:r>
+              <w:rPr>
+                <w:sz w:val="20"/>
+              </w:rPr>
+              <w:t>Valid order wrongly rejected</w:t>
+            </w:r>
+          </w:p>
+        </w:tc>
+      </w:tr>
+      <w:tr>
+        <w:tc>
+          <w:tcPr>
+            <w:tcW w:type="dxa" w:w="2340"/>
+          </w:tcPr>
+          <w:p>
+            <w:r/>
+            <w:r>
+              <w:rPr>
+                <w:sz w:val="20"/>
+              </w:rPr>
+              <w:t>SIT-04</w:t>
+            </w:r>
+          </w:p>
+        </w:tc>
+        <w:tc>
+          <w:tcPr>
+            <w:tcW w:type="dxa" w:w="2340"/>
+          </w:tcPr>
+          <w:p>
+            <w:r/>
+            <w:r>
+              <w:rPr>
+                <w:sz w:val="20"/>
+              </w:rPr>
+              <w:t>Pass</w:t>
+            </w:r>
+          </w:p>
+        </w:tc>
+        <w:tc>
+          <w:tcPr>
+            <w:tcW w:type="dxa" w:w="2340"/>
+          </w:tcPr>
+          <w:p>
+            <w:r/>
+            <w:r>
+              <w:rPr>
+                <w:sz w:val="20"/>
+              </w:rPr>
+              <w:t>Pass</w:t>
+            </w:r>
+          </w:p>
+        </w:tc>
+        <w:tc>
+          <w:tcPr>
+            <w:tcW w:type="dxa" w:w="2340"/>
+          </w:tcPr>
+          <w:p>
+            <w:r/>
+            <w:r>
+              <w:rPr>
+                <w:sz w:val="20"/>
+              </w:rPr>
+              <w:t>Only checks payment did not fail</w:t>
+            </w:r>
+          </w:p>
+        </w:tc>
+      </w:tr>
+      <w:tr>
+        <w:tc>
+          <w:tcPr>
+            <w:tcW w:type="dxa" w:w="2340"/>
+          </w:tcPr>
+          <w:p>
+            <w:r/>
+            <w:r>
+              <w:rPr>
+                <w:sz w:val="20"/>
+              </w:rPr>
+              <w:t>SIT-05</w:t>
+            </w:r>
+          </w:p>
+        </w:tc>
+        <w:tc>
+          <w:tcPr>
+            <w:tcW w:type="dxa" w:w="2340"/>
+          </w:tcPr>
+          <w:p>
+            <w:r/>
+            <w:r>
+              <w:rPr>
+                <w:sz w:val="20"/>
+              </w:rPr>
+              <w:t>Pass</w:t>
+            </w:r>
+          </w:p>
+        </w:tc>
+        <w:tc>
+          <w:tcPr>
+            <w:tcW w:type="dxa" w:w="2340"/>
+          </w:tcPr>
+          <w:p>
+            <w:r/>
+            <w:r>
+              <w:rPr>
+                <w:sz w:val="20"/>
+              </w:rPr>
+              <w:t>Fail</w:t>
+            </w:r>
+          </w:p>
+        </w:tc>
+        <w:tc>
+          <w:tcPr>
+            <w:tcW w:type="dxa" w:w="2340"/>
+          </w:tcPr>
+          <w:p>
+            <w:r/>
+            <w:r>
+              <w:rPr>
+                <w:sz w:val="20"/>
+              </w:rPr>
+              <w:t>Valid order wrongly rejected</w:t>
+            </w:r>
+          </w:p>
+        </w:tc>
+      </w:tr>
+      <w:tr>
+        <w:tc>
+          <w:tcPr>
+            <w:tcW w:type="dxa" w:w="2340"/>
+          </w:tcPr>
+          <w:p>
+            <w:r/>
+            <w:r>
+              <w:rPr>
+                <w:sz w:val="20"/>
+              </w:rPr>
+              <w:t>SIT-06</w:t>
+            </w:r>
+          </w:p>
+        </w:tc>
+        <w:tc>
+          <w:tcPr>
+            <w:tcW w:type="dxa" w:w="2340"/>
+          </w:tcPr>
+          <w:p>
+            <w:r/>
+            <w:r>
+              <w:rPr>
+                <w:sz w:val="20"/>
+              </w:rPr>
+              <w:t>Pass</w:t>
+            </w:r>
+          </w:p>
+        </w:tc>
+        <w:tc>
+          <w:tcPr>
+            <w:tcW w:type="dxa" w:w="2340"/>
+          </w:tcPr>
+          <w:p>
+            <w:r/>
+            <w:r>
+              <w:rPr>
+                <w:sz w:val="20"/>
+              </w:rPr>
+              <w:t>Fail</w:t>
+            </w:r>
+          </w:p>
+        </w:tc>
+        <w:tc>
+          <w:tcPr>
+            <w:tcW w:type="dxa" w:w="2340"/>
+          </w:tcPr>
+          <w:p>
+            <w:r/>
+            <w:r>
+              <w:rPr>
+                <w:sz w:val="20"/>
+              </w:rPr>
+              <w:t>Valid order wrongly rejected</w:t>
+            </w:r>
+          </w:p>
+        </w:tc>
+      </w:tr>
+      <w:tr>
+        <w:tc>
+          <w:tcPr>
+            <w:tcW w:type="dxa" w:w="2340"/>
+          </w:tcPr>
+          <w:p>
+            <w:r/>
+            <w:r>
+              <w:rPr>
+                <w:sz w:val="20"/>
+              </w:rPr>
+              <w:t>SIT-07</w:t>
+            </w:r>
+          </w:p>
+        </w:tc>
+        <w:tc>
+          <w:tcPr>
+            <w:tcW w:type="dxa" w:w="2340"/>
+          </w:tcPr>
+          <w:p>
+            <w:r/>
+            <w:r>
+              <w:rPr>
+                <w:sz w:val="20"/>
+              </w:rPr>
+              <w:t>Pass</w:t>
+            </w:r>
+          </w:p>
+        </w:tc>
+        <w:tc>
+          <w:tcPr>
+            <w:tcW w:type="dxa" w:w="2340"/>
+          </w:tcPr>
+          <w:p>
+            <w:r/>
+            <w:r>
+              <w:rPr>
+                <w:sz w:val="20"/>
+              </w:rPr>
+              <w:t>Fail</w:t>
+            </w:r>
+          </w:p>
+        </w:tc>
+        <w:tc>
+          <w:tcPr>
+            <w:tcW w:type="dxa" w:w="2340"/>
+          </w:tcPr>
+          <w:p>
+            <w:r/>
+            <w:r>
+              <w:rPr>
+                <w:sz w:val="20"/>
+              </w:rPr>
+              <w:t>Large order wrongly accepted</w:t>
+            </w:r>
+          </w:p>
+        </w:tc>
+      </w:tr>
+      <w:tr>
+        <w:tc>
+          <w:tcPr>
+            <w:tcW w:type="dxa" w:w="2340"/>
+          </w:tcPr>
+          <w:p>
+            <w:r/>
+            <w:r>
+              <w:rPr>
+                <w:sz w:val="20"/>
+              </w:rPr>
+              <w:t>SIT-08</w:t>
+            </w:r>
+          </w:p>
+        </w:tc>
+        <w:tc>
+          <w:tcPr>
+            <w:tcW w:type="dxa" w:w="2340"/>
+          </w:tcPr>
+          <w:p>
+            <w:r/>
+            <w:r>
+              <w:rPr>
+                <w:sz w:val="20"/>
+              </w:rPr>
+              <w:t>Pass</w:t>
+            </w:r>
+          </w:p>
+        </w:tc>
+        <w:tc>
+          <w:tcPr>
+            <w:tcW w:type="dxa" w:w="2340"/>
+          </w:tcPr>
+          <w:p>
+            <w:r/>
+            <w:r>
+              <w:rPr>
+                <w:sz w:val="20"/>
+              </w:rPr>
+              <w:t>Pass</w:t>
+            </w:r>
+          </w:p>
+        </w:tc>
+        <w:tc>
+          <w:tcPr>
+            <w:tcW w:type="dxa" w:w="2340"/>
+          </w:tcPr>
+          <w:p>
+            <w:r/>
+            <w:r>
+              <w:rPr>
+                <w:sz w:val="20"/>
+              </w:rPr>
+              <w:t>Stops at product check</w:t>
+            </w:r>
+          </w:p>
+        </w:tc>
+      </w:tr>
+      <w:tr>
+        <w:tc>
+          <w:tcPr>
+            <w:tcW w:type="dxa" w:w="2340"/>
+          </w:tcPr>
+          <w:p>
+            <w:r/>
+            <w:r>
+              <w:rPr>
+                <w:sz w:val="20"/>
+              </w:rPr>
+              <w:t>SIT-09</w:t>
+            </w:r>
+          </w:p>
+        </w:tc>
+        <w:tc>
+          <w:tcPr>
+            <w:tcW w:type="dxa" w:w="2340"/>
+          </w:tcPr>
+          <w:p>
+            <w:r/>
+            <w:r>
+              <w:rPr>
+                <w:sz w:val="20"/>
+              </w:rPr>
+              <w:t>Pass</w:t>
+            </w:r>
+          </w:p>
+        </w:tc>
+        <w:tc>
+          <w:tcPr>
+            <w:tcW w:type="dxa" w:w="2340"/>
+          </w:tcPr>
+          <w:p>
+            <w:r/>
+            <w:r>
+              <w:rPr>
+                <w:sz w:val="20"/>
+              </w:rPr>
+              <w:t>Pass</w:t>
+            </w:r>
+          </w:p>
+        </w:tc>
+        <w:tc>
+          <w:tcPr>
+            <w:tcW w:type="dxa" w:w="2340"/>
+          </w:tcPr>
+          <w:p>
+            <w:r/>
+            <w:r>
+              <w:rPr>
+                <w:sz w:val="20"/>
+              </w:rPr>
+              <w:t>Stops at login</w:t>
+            </w:r>
+          </w:p>
+        </w:tc>
+      </w:tr>
+      <w:tr>
+        <w:tc>
+          <w:tcPr>
+            <w:tcW w:type="dxa" w:w="2340"/>
+          </w:tcPr>
+          <w:p>
+            <w:r/>
+            <w:r>
+              <w:rPr>
+                <w:sz w:val="20"/>
+              </w:rPr>
+              <w:t>SIT-10</w:t>
+            </w:r>
+          </w:p>
+        </w:tc>
+        <w:tc>
+          <w:tcPr>
+            <w:tcW w:type="dxa" w:w="2340"/>
+          </w:tcPr>
+          <w:p>
+            <w:r/>
+            <w:r>
+              <w:rPr>
+                <w:sz w:val="20"/>
+              </w:rPr>
+              <w:t>Pass</w:t>
+            </w:r>
+          </w:p>
+        </w:tc>
+        <w:tc>
+          <w:tcPr>
+            <w:tcW w:type="dxa" w:w="2340"/>
+          </w:tcPr>
+          <w:p>
+            <w:r/>
+            <w:r>
+              <w:rPr>
+                <w:sz w:val="20"/>
+              </w:rPr>
+              <w:t>Fail</w:t>
+            </w:r>
+          </w:p>
+        </w:tc>
+        <w:tc>
+          <w:tcPr>
+            <w:tcW w:type="dxa" w:w="2340"/>
+          </w:tcPr>
+          <w:p>
+            <w:r/>
+            <w:r>
+              <w:rPr>
+                <w:sz w:val="20"/>
+              </w:rPr>
+              <w:t>Rejected as stock issue, not payment</w:t>
+            </w:r>
+          </w:p>
+        </w:tc>
+      </w:tr>
+      <w:tr>
+        <w:tc>
+          <w:tcPr>
+            <w:tcW w:type="dxa" w:w="2340"/>
+          </w:tcPr>
+          <w:p>
+            <w:r/>
+            <w:r>
+              <w:rPr>
+                <w:sz w:val="20"/>
+              </w:rPr>
+              <w:t>End-to-end</w:t>
+            </w:r>
+          </w:p>
+        </w:tc>
+        <w:tc>
+          <w:tcPr>
+            <w:tcW w:type="dxa" w:w="2340"/>
+          </w:tcPr>
+          <w:p>
+            <w:r/>
+            <w:r>
+              <w:rPr>
+                <w:sz w:val="20"/>
+              </w:rPr>
+              <w:t>Pass</w:t>
+            </w:r>
+          </w:p>
+        </w:tc>
+        <w:tc>
+          <w:tcPr>
+            <w:tcW w:type="dxa" w:w="2340"/>
+          </w:tcPr>
+          <w:p>
+            <w:r/>
+            <w:r>
+              <w:rPr>
+                <w:sz w:val="20"/>
+              </w:rPr>
+              <w:t>Fail</w:t>
+            </w:r>
+          </w:p>
+        </w:tc>
+        <w:tc>
+          <w:tcPr>
+            <w:tcW w:type="dxa" w:w="2340"/>
+          </w:tcPr>
+          <w:p>
+            <w:r/>
+            <w:r>
+              <w:rPr>
+                <w:sz w:val="20"/>
+              </w:rPr>
+              <w:t>Valid order wrongly rejected</w:t>
+            </w:r>
+          </w:p>
+        </w:tc>
+      </w:tr>
+    </w:tbl>
     <w:p>
       <w:pPr>
         <w:pStyle w:val="BodyText"/>
@@ -1771,6 +2699,11 @@
         <w:t xml:space="preserve">All ten planned integration scenarios pass on the correct code, and the seeded defect is caught immediately. SIT therefore complements unit testing by validating interfaces and data flow between modules.</w:t>
       </w:r>
     </w:p>
+    <w:p>
+      <w:r>
+        <w:t>The exercise also showed that test design matters: tests that stop before the faulty code path (SIT-08, SIT-09) cannot detect it, so a SIT suite needs both positive and negative scenarios that exercise every module boundary.</w:t>
+      </w:r>
+    </w:p>
     <w:bookmarkEnd w:id="24"/>
     <w:bookmarkStart w:id="25" w:name="appendix-running-the-project"/>
     <w:p>
@@ -1780,6 +2713,20 @@
       <w:r>
         <w:t xml:space="preserve">Appendix: running the project</w:t>
       </w:r>
+    </w:p>
+    <w:p>
+      <w:r>
+        <w:t xml:space="preserve">Source code: </w:t>
+      </w:r>
+      <w:hyperlink r:id="rId12">
+        <w:r>
+          <w:rPr>
+            <w:color w:val="0563C1"/>
+            <w:u w:val="single"/>
+          </w:rPr>
+          <w:t>https://github.com/Llego-250/26973---27396-Assignment-2</w:t>
+        </w:r>
+      </w:hyperlink>
     </w:p>
     <w:p>
       <w:pPr>

</xml_diff>